<commit_message>
Summer Internship Assignment 2
</commit_message>
<xml_diff>
--- a/Celebal_Task_2/SQL_Task2_Report.docx
+++ b/Celebal_Task_2/SQL_Task2_Report.docx
@@ -139,7 +139,7 @@
           <w:lang w:eastAsia="en-IN"/>
         </w:rPr>
         <w:pict>
-          <v:rect id="_x0000_i1026" style="width:0;height:1.5pt" o:hralign="center" o:hrstd="t" o:hr="t" fillcolor="#a0a0a0" stroked="f"/>
+          <v:rect id="_x0000_i1025" style="width:0;height:1.5pt" o:hralign="center" o:hrstd="t" o:hr="t" fillcolor="#a0a0a0" stroked="f"/>
         </w:pict>
       </w:r>
     </w:p>
@@ -223,7 +223,7 @@
           <w:lang w:eastAsia="en-IN"/>
         </w:rPr>
         <w:pict>
-          <v:rect id="_x0000_i1028" style="width:0;height:1.5pt" o:hralign="center" o:hrstd="t" o:hr="t" fillcolor="#a0a0a0" stroked="f"/>
+          <v:rect id="_x0000_i1026" style="width:0;height:1.5pt" o:hralign="center" o:hrstd="t" o:hr="t" fillcolor="#a0a0a0" stroked="f"/>
         </w:pict>
       </w:r>
     </w:p>
@@ -446,7 +446,7 @@
           <w:lang w:eastAsia="en-IN"/>
         </w:rPr>
         <w:pict>
-          <v:rect id="_x0000_i1033" style="width:0;height:1.5pt" o:hralign="center" o:hrstd="t" o:hr="t" fillcolor="#a0a0a0" stroked="f"/>
+          <v:rect id="_x0000_i1027" style="width:0;height:1.5pt" o:hralign="center" o:hrstd="t" o:hr="t" fillcolor="#a0a0a0" stroked="f"/>
         </w:pict>
       </w:r>
     </w:p>
@@ -880,7 +880,7 @@
           <w:lang w:eastAsia="en-IN"/>
         </w:rPr>
         <w:pict>
-          <v:rect id="_x0000_i1244" style="width:0;height:1.5pt" o:hralign="center" o:hrstd="t" o:hr="t" fillcolor="#a0a0a0" stroked="f"/>
+          <v:rect id="_x0000_i1028" style="width:0;height:1.5pt" o:hralign="center" o:hrstd="t" o:hr="t" fillcolor="#a0a0a0" stroked="f"/>
         </w:pict>
       </w:r>
     </w:p>
@@ -976,6 +976,7 @@
           <w:rFonts w:ascii="Palatino Linotype" w:eastAsia="Times New Roman" w:hAnsi="Palatino Linotype" w:cs="Times New Roman"/>
           <w:b/>
           <w:bCs/>
+          <w:noProof/>
           <w:lang w:eastAsia="en-IN"/>
         </w:rPr>
         <w:drawing>
@@ -1020,7 +1021,7 @@
           <w:lang w:eastAsia="en-IN"/>
         </w:rPr>
         <w:pict>
-          <v:rect id="_x0000_i1036" style="width:0;height:1.5pt" o:hralign="center" o:hrstd="t" o:hr="t" fillcolor="#a0a0a0" stroked="f"/>
+          <v:rect id="_x0000_i1029" style="width:0;height:1.5pt" o:hralign="center" o:hrstd="t" o:hr="t" fillcolor="#a0a0a0" stroked="f"/>
         </w:pict>
       </w:r>
     </w:p>
@@ -1067,6 +1068,7 @@
           <w:rFonts w:ascii="Palatino Linotype" w:eastAsia="Times New Roman" w:hAnsi="Palatino Linotype" w:cs="Times New Roman"/>
           <w:b/>
           <w:bCs/>
+          <w:noProof/>
           <w:lang w:eastAsia="en-IN"/>
         </w:rPr>
         <w:drawing>
@@ -1111,7 +1113,7 @@
           <w:lang w:eastAsia="en-IN"/>
         </w:rPr>
         <w:pict>
-          <v:rect id="_x0000_i1037" style="width:0;height:1.5pt" o:hralign="center" o:hrstd="t" o:hr="t" fillcolor="#a0a0a0" stroked="f"/>
+          <v:rect id="_x0000_i1030" style="width:0;height:1.5pt" o:hralign="center" o:hrstd="t" o:hr="t" fillcolor="#a0a0a0" stroked="f"/>
         </w:pict>
       </w:r>
     </w:p>
@@ -1404,6 +1406,7 @@
           <w:rFonts w:ascii="Palatino Linotype" w:eastAsia="Times New Roman" w:hAnsi="Palatino Linotype" w:cs="Times New Roman"/>
           <w:b/>
           <w:bCs/>
+          <w:noProof/>
           <w:lang w:eastAsia="en-IN"/>
         </w:rPr>
         <w:drawing>
@@ -1482,7 +1485,7 @@
           <w:lang w:eastAsia="en-IN"/>
         </w:rPr>
         <w:pict>
-          <v:rect id="_x0000_i1039" style="width:0;height:1.5pt" o:hralign="center" o:hrstd="t" o:hr="t" fillcolor="#a0a0a0" stroked="f"/>
+          <v:rect id="_x0000_i1031" style="width:0;height:1.5pt" o:hralign="center" o:hrstd="t" o:hr="t" fillcolor="#a0a0a0" stroked="f"/>
         </w:pict>
       </w:r>
     </w:p>
@@ -1549,6 +1552,7 @@
           <w:rFonts w:ascii="Palatino Linotype" w:eastAsia="Times New Roman" w:hAnsi="Palatino Linotype" w:cs="Times New Roman"/>
           <w:b/>
           <w:bCs/>
+          <w:noProof/>
           <w:lang w:eastAsia="en-IN"/>
         </w:rPr>
         <w:drawing>
@@ -1631,7 +1635,7 @@
           <w:lang w:eastAsia="en-IN"/>
         </w:rPr>
         <w:pict>
-          <v:rect id="_x0000_i1040" style="width:0;height:1.5pt" o:hralign="center" o:hrstd="t" o:hr="t" fillcolor="#a0a0a0" stroked="f"/>
+          <v:rect id="_x0000_i1032" style="width:0;height:1.5pt" o:hralign="center" o:hrstd="t" o:hr="t" fillcolor="#a0a0a0" stroked="f"/>
         </w:pict>
       </w:r>
     </w:p>
@@ -1941,6 +1945,7 @@
       <w:r>
         <w:rPr>
           <w:rFonts w:ascii="Palatino Linotype" w:eastAsia="Times New Roman" w:hAnsi="Palatino Linotype" w:cs="Times New Roman"/>
+          <w:noProof/>
           <w:lang w:eastAsia="en-IN"/>
         </w:rPr>
         <w:drawing>
@@ -1994,7 +1999,7 @@
           <w:lang w:eastAsia="en-IN"/>
         </w:rPr>
         <w:pict>
-          <v:rect id="_x0000_i1041" style="width:0;height:1.5pt" o:hralign="center" o:hrstd="t" o:hr="t" fillcolor="#a0a0a0" stroked="f"/>
+          <v:rect id="_x0000_i1033" style="width:0;height:1.5pt" o:hralign="center" o:hrstd="t" o:hr="t" fillcolor="#a0a0a0" stroked="f"/>
         </w:pict>
       </w:r>
     </w:p>
@@ -2086,6 +2091,7 @@
       <w:r>
         <w:rPr>
           <w:rFonts w:ascii="Palatino Linotype" w:eastAsia="Times New Roman" w:hAnsi="Palatino Linotype" w:cs="Times New Roman"/>
+          <w:noProof/>
           <w:lang w:eastAsia="en-IN"/>
         </w:rPr>
         <w:drawing>
@@ -2130,7 +2136,7 @@
           <w:lang w:eastAsia="en-IN"/>
         </w:rPr>
         <w:pict>
-          <v:rect id="_x0000_i1042" style="width:0;height:1.5pt" o:hralign="center" o:hrstd="t" o:hr="t" fillcolor="#a0a0a0" stroked="f"/>
+          <v:rect id="_x0000_i1034" style="width:0;height:1.5pt" o:hralign="center" o:hrstd="t" o:hr="t" fillcolor="#a0a0a0" stroked="f"/>
         </w:pict>
       </w:r>
     </w:p>
@@ -2184,6 +2190,7 @@
       <w:r>
         <w:rPr>
           <w:rFonts w:ascii="Palatino Linotype" w:eastAsia="Times New Roman" w:hAnsi="Palatino Linotype" w:cs="Times New Roman"/>
+          <w:noProof/>
           <w:lang w:eastAsia="en-IN"/>
         </w:rPr>
         <w:drawing>
@@ -2228,7 +2235,7 @@
           <w:lang w:eastAsia="en-IN"/>
         </w:rPr>
         <w:pict>
-          <v:rect id="_x0000_i1043" style="width:0;height:1.5pt" o:hralign="center" o:hrstd="t" o:hr="t" fillcolor="#a0a0a0" stroked="f"/>
+          <v:rect id="_x0000_i1035" style="width:0;height:1.5pt" o:hralign="center" o:hrstd="t" o:hr="t" fillcolor="#a0a0a0" stroked="f"/>
         </w:pict>
       </w:r>
     </w:p>
@@ -2282,6 +2289,7 @@
       <w:r>
         <w:rPr>
           <w:rFonts w:ascii="Palatino Linotype" w:eastAsia="Times New Roman" w:hAnsi="Palatino Linotype" w:cs="Times New Roman"/>
+          <w:noProof/>
           <w:lang w:eastAsia="en-IN"/>
         </w:rPr>
         <w:drawing>
@@ -2326,7 +2334,7 @@
           <w:lang w:eastAsia="en-IN"/>
         </w:rPr>
         <w:pict>
-          <v:rect id="_x0000_i1044" style="width:0;height:1.5pt" o:hralign="center" o:hrstd="t" o:hr="t" fillcolor="#a0a0a0" stroked="f"/>
+          <v:rect id="_x0000_i1036" style="width:0;height:1.5pt" o:hralign="center" o:hrstd="t" o:hr="t" fillcolor="#a0a0a0" stroked="f"/>
         </w:pict>
       </w:r>
     </w:p>
@@ -2523,6 +2531,7 @@
         <w:rPr>
           <w:rFonts w:ascii="Palatino Linotype" w:eastAsia="Times New Roman" w:hAnsi="Palatino Linotype" w:cs="Times New Roman"/>
           <w:bCs/>
+          <w:noProof/>
           <w:lang w:eastAsia="en-IN"/>
         </w:rPr>
         <w:drawing>
@@ -2641,7 +2650,7 @@
           <w:lang w:eastAsia="en-IN"/>
         </w:rPr>
         <w:pict>
-          <v:rect id="_x0000_i1045" style="width:0;height:1.5pt" o:hralign="center" o:hrstd="t" o:hr="t" fillcolor="#a0a0a0" stroked="f"/>
+          <v:rect id="_x0000_i1037" style="width:0;height:1.5pt" o:hralign="center" o:hrstd="t" o:hr="t" fillcolor="#a0a0a0" stroked="f"/>
         </w:pict>
       </w:r>
     </w:p>
@@ -2785,6 +2794,7 @@
       <w:r>
         <w:rPr>
           <w:rFonts w:ascii="Palatino Linotype" w:eastAsia="Times New Roman" w:hAnsi="Palatino Linotype" w:cs="Times New Roman"/>
+          <w:noProof/>
           <w:lang w:eastAsia="en-IN"/>
         </w:rPr>
         <w:drawing>
@@ -2929,7 +2939,7 @@
           <w:lang w:eastAsia="en-IN"/>
         </w:rPr>
         <w:pict>
-          <v:rect id="_x0000_i1046" style="width:0;height:1.5pt" o:hralign="center" o:hrstd="t" o:hr="t" fillcolor="#a0a0a0" stroked="f"/>
+          <v:rect id="_x0000_i1038" style="width:0;height:1.5pt" o:hralign="center" o:hrstd="t" o:hr="t" fillcolor="#a0a0a0" stroked="f"/>
         </w:pict>
       </w:r>
     </w:p>
@@ -3021,6 +3031,7 @@
       <w:r>
         <w:rPr>
           <w:rFonts w:ascii="Palatino Linotype" w:eastAsia="Times New Roman" w:hAnsi="Palatino Linotype" w:cs="Times New Roman"/>
+          <w:noProof/>
           <w:sz w:val="24"/>
           <w:szCs w:val="24"/>
           <w:lang w:eastAsia="en-IN"/>
@@ -3069,7 +3080,7 @@
           <w:lang w:eastAsia="en-IN"/>
         </w:rPr>
         <w:pict>
-          <v:rect id="_x0000_i1047" style="width:0;height:1.5pt" o:hralign="center" o:hrstd="t" o:hr="t" fillcolor="#a0a0a0" stroked="f"/>
+          <v:rect id="_x0000_i1039" style="width:0;height:1.5pt" o:hralign="center" o:hrstd="t" o:hr="t" fillcolor="#a0a0a0" stroked="f"/>
         </w:pict>
       </w:r>
     </w:p>
@@ -3141,6 +3152,7 @@
       <w:r>
         <w:rPr>
           <w:rFonts w:ascii="Palatino Linotype" w:eastAsia="Times New Roman" w:hAnsi="Palatino Linotype" w:cs="Times New Roman"/>
+          <w:noProof/>
           <w:sz w:val="24"/>
           <w:szCs w:val="24"/>
           <w:lang w:eastAsia="en-IN"/>
@@ -3189,7 +3201,7 @@
           <w:lang w:eastAsia="en-IN"/>
         </w:rPr>
         <w:pict>
-          <v:rect id="_x0000_i1048" style="width:0;height:1.5pt" o:hralign="center" o:hrstd="t" o:hr="t" fillcolor="#a0a0a0" stroked="f"/>
+          <v:rect id="_x0000_i1040" style="width:0;height:1.5pt" o:hralign="center" o:hrstd="t" o:hr="t" fillcolor="#a0a0a0" stroked="f"/>
         </w:pict>
       </w:r>
     </w:p>
@@ -3261,6 +3273,7 @@
       <w:r>
         <w:rPr>
           <w:rFonts w:ascii="Palatino Linotype" w:eastAsia="Times New Roman" w:hAnsi="Palatino Linotype" w:cs="Times New Roman"/>
+          <w:noProof/>
           <w:sz w:val="24"/>
           <w:szCs w:val="24"/>
           <w:lang w:eastAsia="en-IN"/>
@@ -3309,7 +3322,7 @@
           <w:lang w:eastAsia="en-IN"/>
         </w:rPr>
         <w:pict>
-          <v:rect id="_x0000_i1049" style="width:0;height:1.5pt" o:hralign="center" o:hrstd="t" o:hr="t" fillcolor="#a0a0a0" stroked="f"/>
+          <v:rect id="_x0000_i1041" style="width:0;height:1.5pt" o:hralign="center" o:hrstd="t" o:hr="t" fillcolor="#a0a0a0" stroked="f"/>
         </w:pict>
       </w:r>
     </w:p>
@@ -3464,6 +3477,7 @@
       <w:r>
         <w:rPr>
           <w:rFonts w:ascii="Palatino Linotype" w:eastAsia="Times New Roman" w:hAnsi="Palatino Linotype" w:cs="Times New Roman"/>
+          <w:noProof/>
           <w:sz w:val="24"/>
           <w:szCs w:val="24"/>
           <w:lang w:eastAsia="en-IN"/>
@@ -3512,7 +3526,7 @@
           <w:lang w:eastAsia="en-IN"/>
         </w:rPr>
         <w:pict>
-          <v:rect id="_x0000_i1050" style="width:0;height:1.5pt" o:hralign="center" o:hrstd="t" o:hr="t" fillcolor="#a0a0a0" stroked="f"/>
+          <v:rect id="_x0000_i1042" style="width:0;height:1.5pt" o:hralign="center" o:hrstd="t" o:hr="t" fillcolor="#a0a0a0" stroked="f"/>
         </w:pict>
       </w:r>
     </w:p>
@@ -3562,6 +3576,7 @@
       <w:r>
         <w:rPr>
           <w:rFonts w:ascii="Palatino Linotype" w:eastAsia="Times New Roman" w:hAnsi="Palatino Linotype" w:cs="Times New Roman"/>
+          <w:noProof/>
           <w:sz w:val="24"/>
           <w:szCs w:val="24"/>
           <w:lang w:eastAsia="en-IN"/>
@@ -3610,7 +3625,7 @@
           <w:lang w:eastAsia="en-IN"/>
         </w:rPr>
         <w:pict>
-          <v:rect id="_x0000_i1051" style="width:0;height:1.5pt" o:hralign="center" o:hrstd="t" o:hr="t" fillcolor="#a0a0a0" stroked="f"/>
+          <v:rect id="_x0000_i1043" style="width:0;height:1.5pt" o:hralign="center" o:hrstd="t" o:hr="t" fillcolor="#a0a0a0" stroked="f"/>
         </w:pict>
       </w:r>
     </w:p>
@@ -3702,6 +3717,7 @@
       <w:r>
         <w:rPr>
           <w:rFonts w:ascii="Palatino Linotype" w:eastAsia="Times New Roman" w:hAnsi="Palatino Linotype" w:cs="Times New Roman"/>
+          <w:noProof/>
           <w:sz w:val="24"/>
           <w:szCs w:val="24"/>
           <w:lang w:eastAsia="en-IN"/>
@@ -3750,7 +3766,7 @@
           <w:lang w:eastAsia="en-IN"/>
         </w:rPr>
         <w:pict>
-          <v:rect id="_x0000_i1052" style="width:0;height:1.5pt" o:hralign="center" o:hrstd="t" o:hr="t" fillcolor="#a0a0a0" stroked="f"/>
+          <v:rect id="_x0000_i1044" style="width:0;height:1.5pt" o:hralign="center" o:hrstd="t" o:hr="t" fillcolor="#a0a0a0" stroked="f"/>
         </w:pict>
       </w:r>
     </w:p>
@@ -3989,6 +4005,7 @@
       <w:r>
         <w:rPr>
           <w:rFonts w:ascii="Palatino Linotype" w:eastAsia="Times New Roman" w:hAnsi="Palatino Linotype" w:cs="Times New Roman"/>
+          <w:noProof/>
           <w:lang w:eastAsia="en-IN"/>
         </w:rPr>
         <w:drawing>
@@ -4033,7 +4050,7 @@
           <w:lang w:eastAsia="en-IN"/>
         </w:rPr>
         <w:pict>
-          <v:rect id="_x0000_i1053" style="width:0;height:1.5pt" o:hralign="center" o:hrstd="t" o:hr="t" fillcolor="#a0a0a0" stroked="f"/>
+          <v:rect id="_x0000_i1045" style="width:0;height:1.5pt" o:hralign="center" o:hrstd="t" o:hr="t" fillcolor="#a0a0a0" stroked="f"/>
         </w:pict>
       </w:r>
     </w:p>
@@ -4087,6 +4104,7 @@
       <w:r>
         <w:rPr>
           <w:rFonts w:ascii="Palatino Linotype" w:eastAsia="Times New Roman" w:hAnsi="Palatino Linotype" w:cs="Times New Roman"/>
+          <w:noProof/>
           <w:lang w:eastAsia="en-IN"/>
         </w:rPr>
         <w:drawing>
@@ -4131,7 +4149,7 @@
           <w:lang w:eastAsia="en-IN"/>
         </w:rPr>
         <w:pict>
-          <v:rect id="_x0000_i1054" style="width:0;height:1.5pt" o:hralign="center" o:hrstd="t" o:hr="t" fillcolor="#a0a0a0" stroked="f"/>
+          <v:rect id="_x0000_i1046" style="width:0;height:1.5pt" o:hralign="center" o:hrstd="t" o:hr="t" fillcolor="#a0a0a0" stroked="f"/>
         </w:pict>
       </w:r>
     </w:p>
@@ -4397,6 +4415,7 @@
       <w:r>
         <w:rPr>
           <w:rFonts w:ascii="Palatino Linotype" w:eastAsia="Times New Roman" w:hAnsi="Palatino Linotype" w:cs="Times New Roman"/>
+          <w:noProof/>
           <w:lang w:eastAsia="en-IN"/>
         </w:rPr>
         <w:drawing>
@@ -4441,7 +4460,7 @@
           <w:lang w:eastAsia="en-IN"/>
         </w:rPr>
         <w:pict>
-          <v:rect id="_x0000_i1055" style="width:0;height:1.5pt" o:hralign="center" o:hrstd="t" o:hr="t" fillcolor="#a0a0a0" stroked="f"/>
+          <v:rect id="_x0000_i1047" style="width:0;height:1.5pt" o:hralign="center" o:hrstd="t" o:hr="t" fillcolor="#a0a0a0" stroked="f"/>
         </w:pict>
       </w:r>
     </w:p>
@@ -4853,6 +4872,7 @@
       <w:r>
         <w:rPr>
           <w:rFonts w:ascii="Palatino Linotype" w:eastAsia="Times New Roman" w:hAnsi="Palatino Linotype" w:cs="Times New Roman"/>
+          <w:noProof/>
           <w:lang w:eastAsia="en-IN"/>
         </w:rPr>
         <w:drawing>
@@ -4968,7 +4988,7 @@
           <w:lang w:eastAsia="en-IN"/>
         </w:rPr>
         <w:pict>
-          <v:rect id="_x0000_i1057" style="width:0;height:1.5pt" o:hralign="center" o:hrstd="t" o:hr="t" fillcolor="#a0a0a0" stroked="f"/>
+          <v:rect id="_x0000_i1048" style="width:0;height:1.5pt" o:hralign="center" o:hrstd="t" o:hr="t" fillcolor="#a0a0a0" stroked="f"/>
         </w:pict>
       </w:r>
     </w:p>
@@ -5316,6 +5336,7 @@
       <w:r>
         <w:rPr>
           <w:rFonts w:ascii="Palatino Linotype" w:eastAsia="Times New Roman" w:hAnsi="Palatino Linotype" w:cs="Times New Roman"/>
+          <w:noProof/>
           <w:lang w:eastAsia="en-IN"/>
         </w:rPr>
         <w:drawing>
@@ -5360,7 +5381,7 @@
           <w:lang w:eastAsia="en-IN"/>
         </w:rPr>
         <w:pict>
-          <v:rect id="_x0000_i1058" style="width:0;height:1.5pt" o:hralign="center" o:hrstd="t" o:hr="t" fillcolor="#a0a0a0" stroked="f"/>
+          <v:rect id="_x0000_i1049" style="width:0;height:1.5pt" o:hralign="center" o:hrstd="t" o:hr="t" fillcolor="#a0a0a0" stroked="f"/>
         </w:pict>
       </w:r>
     </w:p>
@@ -5427,6 +5448,7 @@
       <w:r>
         <w:rPr>
           <w:rFonts w:ascii="Palatino Linotype" w:eastAsia="Times New Roman" w:hAnsi="Palatino Linotype" w:cs="Times New Roman"/>
+          <w:noProof/>
           <w:lang w:eastAsia="en-IN"/>
         </w:rPr>
         <w:drawing>
@@ -5471,7 +5493,7 @@
           <w:lang w:eastAsia="en-IN"/>
         </w:rPr>
         <w:pict>
-          <v:rect id="_x0000_i1059" style="width:0;height:1.5pt" o:hralign="center" o:hrstd="t" o:hr="t" fillcolor="#a0a0a0" stroked="f"/>
+          <v:rect id="_x0000_i1050" style="width:0;height:1.5pt" o:hralign="center" o:hrstd="t" o:hr="t" fillcolor="#a0a0a0" stroked="f"/>
         </w:pict>
       </w:r>
     </w:p>
@@ -5863,7 +5885,7 @@
           <w:lang w:eastAsia="en-IN"/>
         </w:rPr>
         <w:pict>
-          <v:rect id="_x0000_i1060" style="width:0;height:1.5pt" o:hralign="center" o:hrstd="t" o:hr="t" fillcolor="#a0a0a0" stroked="f"/>
+          <v:rect id="_x0000_i1051" style="width:0;height:1.5pt" o:hralign="center" o:hrstd="t" o:hr="t" fillcolor="#a0a0a0" stroked="f"/>
         </w:pict>
       </w:r>
     </w:p>
@@ -6009,8 +6031,6 @@
         </w:rPr>
         <w:t>4. If any step fails, ROLLBACK the entire transaction. Otherwise, COMMIT. Write the complete BEGIN...COMMIT/ROLLBACK block.</w:t>
       </w:r>
-      <w:bookmarkStart w:id="0" w:name="_GoBack"/>
-      <w:bookmarkEnd w:id="0"/>
     </w:p>
     <w:p>
       <w:pPr>
@@ -6028,6 +6048,7 @@
           <w:rFonts w:ascii="Palatino Linotype" w:eastAsia="Times New Roman" w:hAnsi="Palatino Linotype" w:cs="Times New Roman"/>
           <w:b/>
           <w:bCs/>
+          <w:noProof/>
           <w:lang w:eastAsia="en-IN"/>
         </w:rPr>
         <w:lastRenderedPageBreak/>
@@ -6114,7 +6135,7 @@
           <w:lang w:eastAsia="en-IN"/>
         </w:rPr>
         <w:pict>
-          <v:rect id="_x0000_i1061" style="width:0;height:1.5pt" o:hralign="center" o:hrstd="t" o:hr="t" fillcolor="#a0a0a0" stroked="f"/>
+          <v:rect id="_x0000_i1052" style="width:0;height:1.5pt" o:hralign="center" o:hrstd="t" o:hr="t" fillcolor="#a0a0a0" stroked="f"/>
         </w:pict>
       </w:r>
       <w:r>
@@ -6282,7 +6303,7 @@
           <w:szCs w:val="20"/>
           <w:lang w:eastAsia="en-IN"/>
         </w:rPr>
-        <w:t>Celebal_Task_2_SQL</w:t>
+        <w:t>Celebal_Task_2</w:t>
       </w:r>
     </w:p>
     <w:p>
@@ -6311,31 +6332,37 @@
       <w:pPr>
         <w:spacing w:line="276" w:lineRule="auto"/>
         <w:rPr>
-          <w:rFonts w:ascii="Palatino Linotype" w:eastAsia="Times New Roman" w:hAnsi="Palatino Linotype" w:cs="Times New Roman"/>
-          <w:sz w:val="24"/>
-          <w:szCs w:val="24"/>
-          <w:lang w:eastAsia="en-IN"/>
-        </w:rPr>
-      </w:pPr>
-      <w:r>
-        <w:rPr>
-          <w:rFonts w:ascii="Palatino Linotype" w:eastAsia="Times New Roman" w:hAnsi="Palatino Linotype" w:cs="Times New Roman"/>
-          <w:i/>
-          <w:iCs/>
-          <w:sz w:val="24"/>
-          <w:szCs w:val="24"/>
-          <w:lang w:eastAsia="en-IN"/>
-        </w:rPr>
-        <w:t>(Paste your GitHub repository URL here after pushing the project.)</w:t>
-      </w:r>
-    </w:p>
-    <w:p>
-      <w:pPr>
-        <w:spacing w:line="276" w:lineRule="auto"/>
-        <w:rPr>
           <w:rFonts w:ascii="Palatino Linotype" w:hAnsi="Palatino Linotype"/>
         </w:rPr>
       </w:pPr>
+      <w:hyperlink r:id="rId29" w:history="1">
+        <w:r>
+          <w:rPr>
+            <w:rStyle w:val="Hyperlink"/>
+            <w:rFonts w:ascii="Palatino Linotype" w:eastAsia="Times New Roman" w:hAnsi="Palatino Linotype" w:cs="Times New Roman"/>
+            <w:i/>
+            <w:iCs/>
+            <w:sz w:val="24"/>
+            <w:szCs w:val="24"/>
+            <w:lang w:eastAsia="en-IN"/>
+          </w:rPr>
+          <w:t>https://github.com/AdityaG</w:t>
+        </w:r>
+        <w:bookmarkStart w:id="0" w:name="_GoBack"/>
+        <w:bookmarkEnd w:id="0"/>
+        <w:r>
+          <w:rPr>
+            <w:rStyle w:val="Hyperlink"/>
+            <w:rFonts w:ascii="Palatino Linotype" w:eastAsia="Times New Roman" w:hAnsi="Palatino Linotype" w:cs="Times New Roman"/>
+            <w:i/>
+            <w:iCs/>
+            <w:sz w:val="24"/>
+            <w:szCs w:val="24"/>
+            <w:lang w:eastAsia="en-IN"/>
+          </w:rPr>
+          <w:t>G11/Celebal-Summer-Internship-2026/tree/main/Celebal_Task_2</w:t>
+        </w:r>
+      </w:hyperlink>
     </w:p>
     <w:sectPr>
       <w:pgSz w:w="11906" w:h="16838"/>
@@ -9266,6 +9293,7 @@
   <w:style w:type="character" w:default="1" w:styleId="DefaultParagraphFont">
     <w:name w:val="Default Paragraph Font"/>
     <w:uiPriority w:val="1"/>
+    <w:semiHidden/>
     <w:unhideWhenUsed/>
   </w:style>
   <w:style w:type="table" w:default="1" w:styleId="TableNormal">
@@ -9446,6 +9474,17 @@
       <w:ind w:left="720"/>
       <w:contextualSpacing/>
     </w:pPr>
+  </w:style>
+  <w:style w:type="character" w:styleId="Hyperlink">
+    <w:name w:val="Hyperlink"/>
+    <w:basedOn w:val="DefaultParagraphFont"/>
+    <w:uiPriority w:val="99"/>
+    <w:unhideWhenUsed/>
+    <w:rsid w:val="00EF545D"/>
+    <w:rPr>
+      <w:color w:val="0563C1" w:themeColor="hyperlink"/>
+      <w:u w:val="single"/>
+    </w:rPr>
   </w:style>
 </w:styles>
 </file>

</xml_diff>